<commit_message>
Remove 'Implement now' line from implementation prompt
</commit_message>
<xml_diff>
--- a/byouc/Agentic_UseCase_Spec.docx
+++ b/byouc/Agentic_UseCase_Spec.docx
@@ -2676,7 +2676,6 @@
           <w:rFonts w:ascii="Consolas" w:hAnsi="Consolas"/>
           <w:sz w:val="18"/>
         </w:rPr>
-        <w:br/>
       </w:r>
       <w:r>
         <w:rPr>
@@ -2875,7 +2874,6 @@
           <w:rFonts w:ascii="Consolas" w:hAnsi="Consolas"/>
           <w:sz w:val="18"/>
         </w:rPr>
-        <w:br/>
       </w:r>
       <w:r>
         <w:rPr>
@@ -3098,7 +3096,6 @@
           <w:rFonts w:ascii="Consolas" w:hAnsi="Consolas"/>
           <w:sz w:val="18"/>
         </w:rPr>
-        <w:br/>
       </w:r>
       <w:r>
         <w:rPr>
@@ -3113,15 +3110,12 @@
           <w:rFonts w:ascii="Consolas" w:hAnsi="Consolas"/>
           <w:sz w:val="18"/>
         </w:rPr>
-        <w:br/>
       </w:r>
       <w:r>
         <w:rPr>
           <w:rFonts w:ascii="Consolas" w:hAnsi="Consolas"/>
           <w:sz w:val="18"/>
         </w:rPr>
-        <w:br/>
-        <w:t>Implement now — write all the code.</w:t>
       </w:r>
     </w:p>
     <w:p/>

</xml_diff>